<commit_message>
Madhira UGD Tracker v1.1
Changes since v1.0: see docs/RELEASE-NOTES.md. Keeps .env, .gitignore and the pnpm lockfile from the initial upload (lockfile now includes yazl).
</commit_message>
<xml_diff>
--- a/docs/DEPLOY-AWS.docx
+++ b/docs/DEPLOY-AWS.docx
@@ -49,7 +49,7 @@
           <w:sz w:val="21"/>
           <w:szCs w:val="21"/>
         </w:rPr>
-        <w:t xml:space="preserve">Release v1.0 · 2 October 2026 · one AWS EC2 server with Docker (vendor-neutral package)</w:t>
+        <w:t xml:space="preserve">Release v1.1 · 3 October 2026 · one AWS EC2 server with Docker (vendor-neutral package)</w:t>
       </w:r>
     </w:p>
     <w:p>
@@ -426,7 +426,7 @@
                 <w:szCs w:val="19"/>
                 <w:shd w:fill="EEF2F6" w:color="auto" w:val="clear"/>
               </w:rPr>
-              <w:t xml:space="preserve">v1.0</w:t>
+              <w:t xml:space="preserve">v1.1</w:t>
             </w:r>
             <w:r>
               <w:rPr>
@@ -528,10 +528,10 @@
           <w:szCs w:val="19"/>
           <w:shd w:fill="EEF2F6" w:color="auto" w:val="clear"/>
         </w:rPr>
-        <w:t xml:space="preserve">madhira-ugd-v1.0.zip</w:t>
-      </w:r>
-      <w:r>
-        <w:t xml:space="preserve"> (130 MB) and </w:t>
+        <w:t xml:space="preserve">madhira-ugd-v1.1.zip</w:t>
+      </w:r>
+      <w:r>
+        <w:t xml:space="preserve"> (≈130 MB) and </w:t>
       </w:r>
       <w:r>
         <w:rPr>
@@ -557,7 +557,7 @@
         <w:t xml:space="preserve">madhira-ugd/</w:t>
       </w:r>
       <w:r>
-        <w:t xml:space="preserve"> holds every file of release v1.0; Part A turns it into the municipality's Git repository.</w:t>
+        <w:t xml:space="preserve"> holds every file of release v1.1; Part A turns it into the municipality's Git repository.</w:t>
       </w:r>
     </w:p>
     <w:tbl>
@@ -1385,7 +1385,7 @@
           <w:sz w:val="18"/>
           <w:szCs w:val="18"/>
         </w:rPr>
-        <w:t xml:space="preserve"># expected: madhira-ugd-v1.0.zip: OK</w:t>
+        <w:t xml:space="preserve"># expected: madhira-ugd-v1.1.zip: OK</w:t>
       </w:r>
     </w:p>
     <w:p>
@@ -1488,7 +1488,7 @@
           <w:sz w:val="18"/>
           <w:szCs w:val="18"/>
         </w:rPr>
-        <w:t xml:space="preserve">unzip madhira-ugd-v1.0.zip</w:t>
+        <w:t xml:space="preserve">unzip madhira-ugd-v1.1.zip</w:t>
       </w:r>
     </w:p>
     <w:p>
@@ -1552,7 +1552,7 @@
           <w:sz w:val="18"/>
           <w:szCs w:val="18"/>
         </w:rPr>
-        <w:t xml:space="preserve">git commit -m "Madhira UGD Tracker v1.0"</w:t>
+        <w:t xml:space="preserve">git commit -m "Madhira UGD Tracker v1.1"</w:t>
       </w:r>
     </w:p>
     <w:p>
@@ -1568,7 +1568,7 @@
           <w:sz w:val="18"/>
           <w:szCs w:val="18"/>
         </w:rPr>
-        <w:t xml:space="preserve">git tag -a v1.0 -m "Release v1.0"</w:t>
+        <w:t xml:space="preserve">git tag -a v1.1 -m "Release v1.1"</w:t>
       </w:r>
     </w:p>
     <w:p>
@@ -4226,7 +4226,7 @@
           <w:sz w:val="18"/>
           <w:szCs w:val="18"/>
         </w:rPr>
-        <w:t xml:space="preserve">cd /opt/madhira-ugd &amp;&amp; git checkout v1.0</w:t>
+        <w:t xml:space="preserve">cd /opt/madhira-ugd &amp;&amp; git checkout v1.1</w:t>
       </w:r>
     </w:p>
     <w:p>
@@ -4244,7 +4244,7 @@
           <w:szCs w:val="19"/>
           <w:shd w:fill="EEF2F6" w:color="auto" w:val="clear"/>
         </w:rPr>
-        <w:t xml:space="preserve">scp -i madhira-ugd.pem madhira-ugd-v1.0.zip ubuntu@&lt;elastic-ip&gt;:/opt/</w:t>
+        <w:t xml:space="preserve">scp -i madhira-ugd.pem madhira-ugd-v1.1.zip ubuntu@&lt;elastic-ip&gt;:/opt/</w:t>
       </w:r>
       <w:r>
         <w:t xml:space="preserve"> then </w:t>
@@ -4257,7 +4257,7 @@
           <w:szCs w:val="19"/>
           <w:shd w:fill="EEF2F6" w:color="auto" w:val="clear"/>
         </w:rPr>
-        <w:t xml:space="preserve">cd /opt &amp;&amp; unzip madhira-ugd-v1.0.zip</w:t>
+        <w:t xml:space="preserve">cd /opt &amp;&amp; unzip madhira-ugd-v1.1.zip</w:t>
       </w:r>
       <w:r>
         <w:t xml:space="preserve">. The folder must end up at </w:t>
@@ -5162,6 +5162,112 @@
       </w:pPr>
       <w:r>
         <w:t xml:space="preserve">B14. Updates and rollback</w:t>
+      </w:r>
+    </w:p>
+    <w:p>
+      <w:pPr>
+        <w:spacing w:after="120"/>
+      </w:pPr>
+      <w:r>
+        <w:t xml:space="preserve">A new release arrives as a new zip. </w:t>
+      </w:r>
+      <w:r>
+        <w:rPr>
+          <w:b/>
+          <w:bCs/>
+        </w:rPr>
+        <w:t xml:space="preserve">If you already set up the repository from an earlier zip</w:t>
+      </w:r>
+      <w:r>
+        <w:t xml:space="preserve"> (Part A), bring the new files into it on the office machine, then update the server:</w:t>
+      </w:r>
+    </w:p>
+    <w:p>
+      <w:pPr>
+        <w:shd w:fill="F1F5F9" w:color="auto" w:val="clear"/>
+        <w:spacing w:after="0" w:before="40" w:line="260"/>
+        <w:ind w:left="120" w:right="120"/>
+      </w:pPr>
+      <w:r>
+        <w:rPr>
+          <w:rFonts w:ascii="Consolas" w:cs="Consolas" w:eastAsia="Consolas" w:hAnsi="Consolas"/>
+          <w:color w:val="0F172A"/>
+          <w:sz w:val="18"/>
+          <w:szCs w:val="18"/>
+        </w:rPr>
+        <w:t xml:space="preserve">cd madhira-ugd                                  # the repository from Part A</w:t>
+      </w:r>
+    </w:p>
+    <w:p>
+      <w:pPr>
+        <w:shd w:fill="F1F5F9" w:color="auto" w:val="clear"/>
+        <w:spacing w:after="0" w:before="0" w:line="260"/>
+        <w:ind w:left="120" w:right="120"/>
+      </w:pPr>
+      <w:r>
+        <w:rPr>
+          <w:rFonts w:ascii="Consolas" w:cs="Consolas" w:eastAsia="Consolas" w:hAnsi="Consolas"/>
+          <w:color w:val="0F172A"/>
+          <w:sz w:val="18"/>
+          <w:szCs w:val="18"/>
+        </w:rPr>
+        <w:t xml:space="preserve">unzip ../madhira-ugd-v1.1.zip -d /tmp/ugd-new</w:t>
+      </w:r>
+    </w:p>
+    <w:p>
+      <w:pPr>
+        <w:shd w:fill="F1F5F9" w:color="auto" w:val="clear"/>
+        <w:spacing w:after="0" w:before="0" w:line="260"/>
+        <w:ind w:left="120" w:right="120"/>
+      </w:pPr>
+      <w:r>
+        <w:rPr>
+          <w:rFonts w:ascii="Consolas" w:cs="Consolas" w:eastAsia="Consolas" w:hAnsi="Consolas"/>
+          <w:color w:val="0F172A"/>
+          <w:sz w:val="18"/>
+          <w:szCs w:val="18"/>
+        </w:rPr>
+        <w:t xml:space="preserve">rsync -a --delete --exclude .git /tmp/ugd-new/madhira-ugd/ ./</w:t>
+      </w:r>
+    </w:p>
+    <w:p>
+      <w:pPr>
+        <w:shd w:fill="F1F5F9" w:color="auto" w:val="clear"/>
+        <w:spacing w:after="0" w:before="0" w:line="260"/>
+        <w:ind w:left="120" w:right="120"/>
+      </w:pPr>
+      <w:r>
+        <w:rPr>
+          <w:rFonts w:ascii="Consolas" w:cs="Consolas" w:eastAsia="Consolas" w:hAnsi="Consolas"/>
+          <w:color w:val="0F172A"/>
+          <w:sz w:val="18"/>
+          <w:szCs w:val="18"/>
+        </w:rPr>
+        <w:t xml:space="preserve">git add -A &amp;&amp; git commit -m "Madhira UGD Tracker v1.1"</w:t>
+      </w:r>
+    </w:p>
+    <w:p>
+      <w:pPr>
+        <w:shd w:fill="F1F5F9" w:color="auto" w:val="clear"/>
+        <w:spacing w:after="140" w:before="0" w:line="260"/>
+        <w:ind w:left="120" w:right="120"/>
+      </w:pPr>
+      <w:r>
+        <w:rPr>
+          <w:rFonts w:ascii="Consolas" w:cs="Consolas" w:eastAsia="Consolas" w:hAnsi="Consolas"/>
+          <w:color w:val="0F172A"/>
+          <w:sz w:val="18"/>
+          <w:szCs w:val="18"/>
+        </w:rPr>
+        <w:t xml:space="preserve">git tag -a v1.1 -m "Release v1.1" &amp;&amp; git push origin main --tags</w:t>
+      </w:r>
+    </w:p>
+    <w:p>
+      <w:pPr>
+        <w:spacing w:after="120"/>
+      </w:pPr>
+      <w:r>
+        <w:t xml:space="preserve">On the server:</w:t>
       </w:r>
     </w:p>
     <w:p>
@@ -6858,7 +6964,7 @@
                 <w:sz w:val="19"/>
                 <w:szCs w:val="19"/>
               </w:rPr>
-              <w:t xml:space="preserve">v1.0 · </w:t>
+              <w:t xml:space="preserve">v1.1 · </w:t>
             </w:r>
           </w:p>
         </w:tc>

</xml_diff>

<commit_message>
Madhira UGD Tracker v1.2
Changes since v1.1: see docs/RELEASE-NOTES.md. Keeps .env, .gitignore and the pnpm lockfile from the repository.
</commit_message>
<xml_diff>
--- a/docs/DEPLOY-AWS.docx
+++ b/docs/DEPLOY-AWS.docx
@@ -49,7 +49,7 @@
           <w:sz w:val="21"/>
           <w:szCs w:val="21"/>
         </w:rPr>
-        <w:t xml:space="preserve">Release v1.1 · 3 October 2026 · one AWS EC2 server with Docker (vendor-neutral package)</w:t>
+        <w:t xml:space="preserve">Release v1.2 · 6 October 2026 · one AWS EC2 server with Docker (vendor-neutral package)</w:t>
       </w:r>
     </w:p>
     <w:p>
@@ -426,7 +426,7 @@
                 <w:szCs w:val="19"/>
                 <w:shd w:fill="EEF2F6" w:color="auto" w:val="clear"/>
               </w:rPr>
-              <w:t xml:space="preserve">v1.1</w:t>
+              <w:t xml:space="preserve">v1.2</w:t>
             </w:r>
             <w:r>
               <w:rPr>
@@ -496,7 +496,7 @@
                 <w:sz w:val="19"/>
                 <w:szCs w:val="19"/>
               </w:rPr>
-              <w:t xml:space="preserve">Commissioner, AEE and Field Inspector, created on first start with one-time passwords (in the user guides)</w:t>
+              <w:t xml:space="preserve">Commissioner, AEE, Field Inspector and three contracting assistants, created with one-time passwords (in the user guides); an upgrade adds only accounts that are new</w:t>
             </w:r>
           </w:p>
         </w:tc>
@@ -528,7 +528,7 @@
           <w:szCs w:val="19"/>
           <w:shd w:fill="EEF2F6" w:color="auto" w:val="clear"/>
         </w:rPr>
-        <w:t xml:space="preserve">madhira-ugd-v1.1.zip</w:t>
+        <w:t xml:space="preserve">madhira-ugd-v1.2.zip</w:t>
       </w:r>
       <w:r>
         <w:t xml:space="preserve"> (≈130 MB) and </w:t>
@@ -557,7 +557,7 @@
         <w:t xml:space="preserve">madhira-ugd/</w:t>
       </w:r>
       <w:r>
-        <w:t xml:space="preserve"> holds every file of release v1.1; Part A turns it into the municipality's Git repository.</w:t>
+        <w:t xml:space="preserve"> holds every file of release v1.2; Part A turns it into the municipality's Git repository.</w:t>
       </w:r>
     </w:p>
     <w:tbl>
@@ -1385,7 +1385,7 @@
           <w:sz w:val="18"/>
           <w:szCs w:val="18"/>
         </w:rPr>
-        <w:t xml:space="preserve"># expected: madhira-ugd-v1.1.zip: OK</w:t>
+        <w:t xml:space="preserve"># expected: madhira-ugd-v1.2.zip: OK</w:t>
       </w:r>
     </w:p>
     <w:p>
@@ -1419,7 +1419,7 @@
         <w:t xml:space="preserve">docs/</w:t>
       </w:r>
       <w:r>
-        <w:t xml:space="preserve"> contain the starting passwords for the three accounts. They stop working once each person signs in and sets their own password, but treat the package as confidential until then.</w:t>
+        <w:t xml:space="preserve"> contain the starting passwords for the six accounts. They stop working once each person signs in and sets their own password, but treat the package as confidential until then.</w:t>
       </w:r>
     </w:p>
     <w:p>
@@ -1488,7 +1488,7 @@
           <w:sz w:val="18"/>
           <w:szCs w:val="18"/>
         </w:rPr>
-        <w:t xml:space="preserve">unzip madhira-ugd-v1.1.zip</w:t>
+        <w:t xml:space="preserve">unzip madhira-ugd-v1.2.zip</w:t>
       </w:r>
     </w:p>
     <w:p>
@@ -1552,7 +1552,7 @@
           <w:sz w:val="18"/>
           <w:szCs w:val="18"/>
         </w:rPr>
-        <w:t xml:space="preserve">git commit -m "Madhira UGD Tracker v1.1"</w:t>
+        <w:t xml:space="preserve">git commit -m "Madhira UGD Tracker v1.2"</w:t>
       </w:r>
     </w:p>
     <w:p>
@@ -1568,7 +1568,7 @@
           <w:sz w:val="18"/>
           <w:szCs w:val="18"/>
         </w:rPr>
-        <w:t xml:space="preserve">git tag -a v1.1 -m "Release v1.1"</w:t>
+        <w:t xml:space="preserve">git tag -a v1.2 -m "Release v1.2"</w:t>
       </w:r>
     </w:p>
     <w:p>
@@ -4226,7 +4226,7 @@
           <w:sz w:val="18"/>
           <w:szCs w:val="18"/>
         </w:rPr>
-        <w:t xml:space="preserve">cd /opt/madhira-ugd &amp;&amp; git checkout v1.1</w:t>
+        <w:t xml:space="preserve">cd /opt/madhira-ugd &amp;&amp; git checkout v1.2</w:t>
       </w:r>
     </w:p>
     <w:p>
@@ -4244,7 +4244,7 @@
           <w:szCs w:val="19"/>
           <w:shd w:fill="EEF2F6" w:color="auto" w:val="clear"/>
         </w:rPr>
-        <w:t xml:space="preserve">scp -i madhira-ugd.pem madhira-ugd-v1.1.zip ubuntu@&lt;elastic-ip&gt;:/opt/</w:t>
+        <w:t xml:space="preserve">scp -i madhira-ugd.pem madhira-ugd-v1.2.zip ubuntu@&lt;elastic-ip&gt;:/opt/</w:t>
       </w:r>
       <w:r>
         <w:t xml:space="preserve"> then </w:t>
@@ -4257,7 +4257,7 @@
           <w:szCs w:val="19"/>
           <w:shd w:fill="EEF2F6" w:color="auto" w:val="clear"/>
         </w:rPr>
-        <w:t xml:space="preserve">cd /opt &amp;&amp; unzip madhira-ugd-v1.1.zip</w:t>
+        <w:t xml:space="preserve">cd /opt &amp;&amp; unzip madhira-ugd-v1.2.zip</w:t>
       </w:r>
       <w:r>
         <w:t xml:space="preserve">. The folder must end up at </w:t>
@@ -5211,7 +5211,7 @@
           <w:sz w:val="18"/>
           <w:szCs w:val="18"/>
         </w:rPr>
-        <w:t xml:space="preserve">unzip ../madhira-ugd-v1.1.zip -d /tmp/ugd-new</w:t>
+        <w:t xml:space="preserve">unzip ../madhira-ugd-v1.2.zip -d /tmp/ugd-new</w:t>
       </w:r>
     </w:p>
     <w:p>
@@ -5243,7 +5243,7 @@
           <w:sz w:val="18"/>
           <w:szCs w:val="18"/>
         </w:rPr>
-        <w:t xml:space="preserve">git add -A &amp;&amp; git commit -m "Madhira UGD Tracker v1.1"</w:t>
+        <w:t xml:space="preserve">git add -A &amp;&amp; git commit -m "Madhira UGD Tracker v1.2"</w:t>
       </w:r>
     </w:p>
     <w:p>
@@ -5259,7 +5259,7 @@
           <w:sz w:val="18"/>
           <w:szCs w:val="18"/>
         </w:rPr>
-        <w:t xml:space="preserve">git tag -a v1.1 -m "Release v1.1" &amp;&amp; git push origin main --tags</w:t>
+        <w:t xml:space="preserve">git tag -a v1.2 -m "Release v1.2" &amp;&amp; git push origin main --tags</w:t>
       </w:r>
     </w:p>
     <w:p>
@@ -5315,7 +5315,7 @@
           <w:sz w:val="18"/>
           <w:szCs w:val="18"/>
         </w:rPr>
-        <w:t xml:space="preserve">git fetch --tags &amp;&amp; git checkout v1.1     # the new release tag</w:t>
+        <w:t xml:space="preserve">git fetch --tags &amp;&amp; git checkout v1.2     # the new release tag</w:t>
       </w:r>
     </w:p>
     <w:p>
@@ -6488,17 +6488,20 @@
         <w:spacing w:after="80"/>
       </w:pPr>
       <w:r>
-        <w:t xml:space="preserve">The Commissioner signs in first, sets a password, and gives the AEE and Field Inspector their sign-ins with the </w:t>
-      </w:r>
-      <w:r>
-        <w:rPr>
-          <w:b/>
-          <w:bCs/>
-        </w:rPr>
-        <w:t xml:space="preserve">AEE and Field Inspector Guide</w:t>
-      </w:r>
-      <w:r>
-        <w:t xml:space="preserve">.</w:t>
+        <w:t xml:space="preserve">The Commissioner signs in first, sets a password, and gives the AEE, Field Inspector and contracting assistants their sign-ins with the field staff guide (</w:t>
+      </w:r>
+      <w:r>
+        <w:rPr>
+          <w:rFonts w:ascii="Consolas" w:cs="Consolas" w:eastAsia="Consolas" w:hAnsi="Consolas"/>
+          <w:color w:val="0F172A"/>
+          <w:sz w:val="19"/>
+          <w:szCs w:val="19"/>
+          <w:shd w:fill="EEF2F6" w:color="auto" w:val="clear"/>
+        </w:rPr>
+        <w:t xml:space="preserve">AEE-and-Field-Inspector-Guide.docx</w:t>
+      </w:r>
+      <w:r>
+        <w:t xml:space="preserve">).</w:t>
       </w:r>
     </w:p>
     <w:p>
@@ -6964,7 +6967,7 @@
                 <w:sz w:val="19"/>
                 <w:szCs w:val="19"/>
               </w:rPr>
-              <w:t xml:space="preserve">v1.1 · </w:t>
+              <w:t xml:space="preserve">v1.2 · </w:t>
             </w:r>
           </w:p>
         </w:tc>

</xml_diff>